<commit_message>
feat: add complete WSQ admin slide sequence
</commit_message>
<xml_diff>
--- a/courseware/LP-TGS-2025053916-Basic-Urban-Farming-with-Hydroponics-v2.0.docx
+++ b/courseware/LP-TGS-2025053916-Basic-Urban-Farming-with-Hydroponics-v2.0.docx
@@ -548,7 +548,7 @@
           </w:tcPr>
           <w:p>
             <w:r>
-              <w:t>Briefing, profiles, access, outcomes and safety · slides 1–11</w:t>
+              <w:t>Briefing, profiles, access, outcomes and safety · slides 1–17</w:t>
             </w:r>
           </w:p>
         </w:tc>
@@ -610,7 +610,7 @@
           </w:tcPr>
           <w:p>
             <w:r>
-              <w:t>Foundations and systems · slides 12–39</w:t>
+              <w:t>Foundations and systems · slides 18–45</w:t>
             </w:r>
           </w:p>
         </w:tc>
@@ -734,7 +734,7 @@
           </w:tcPr>
           <w:p>
             <w:r>
-              <w:t>Water, nutrients, crop controls and Singapore cases · slides 40–90</w:t>
+              <w:t>Water, nutrients, crop controls and Singapore cases · slides 46–96</w:t>
             </w:r>
           </w:p>
         </w:tc>
@@ -858,7 +858,7 @@
           </w:tcPr>
           <w:p>
             <w:r>
-              <w:t>Farm tour · slides 91–100</w:t>
+              <w:t>Farm tour · slides 97–106</w:t>
             </w:r>
           </w:p>
         </w:tc>
@@ -920,7 +920,7 @@
           </w:tcPr>
           <w:p>
             <w:r>
-              <w:t>Hydroponics kit practice · slides 101–112</w:t>
+              <w:t>Hydroponics kit practice · slides 107–118</w:t>
             </w:r>
           </w:p>
         </w:tc>
@@ -1044,7 +1044,7 @@
           </w:tcPr>
           <w:p>
             <w:r>
-              <w:t>Aquaponics theory · slides 113–125</w:t>
+              <w:t>Aquaponics theory · slides 119–131</w:t>
             </w:r>
           </w:p>
         </w:tc>
@@ -1106,7 +1106,7 @@
           </w:tcPr>
           <w:p>
             <w:r>
-              <w:t>Assessment and close · slides 126–129</w:t>
+              <w:t>Assessment and close · slides 132–139</w:t>
             </w:r>
           </w:p>
         </w:tc>
@@ -1144,7 +1144,7 @@
     </w:tbl>
     <w:p>
       <w:r>
-        <w:t>Final slide ranges are subject to the generated deck inventory (129 slides); the trainer should use the section dividers and slide-map JSON for exact navigation.</w:t>
+        <w:t>Final slide ranges are subject to the generated deck inventory (139 slides); the trainer should use the section dividers and slide-map JSON for exact navigation.</w:t>
       </w:r>
     </w:p>
     <w:p>

</xml_diff>